<commit_message>
Atualização no documento de requisitos. E projeto do banco de dados interno da aplicação.
</commit_message>
<xml_diff>
--- a/Requisitos/Casos de Uso Usuário.docx
+++ b/Requisitos/Casos de Uso Usuário.docx
@@ -13,15 +13,27 @@
         <w:rPr>
           <w:b/>
         </w:rPr>
-        <w:t>UC01- Manter Organização</w:t>
-      </w:r>
-    </w:p>
-    <w:p>
-      <w:pPr>
-        <w:jc w:val="both"/>
-      </w:pPr>
-      <w:r>
-        <w:t>Permite manter os dados de uma organização que poderá ter vários inventários.</w:t>
+        <w:t xml:space="preserve">UC01- Manter </w:t>
+      </w:r>
+      <w:r>
+        <w:rPr>
+          <w:b/>
+        </w:rPr>
+        <w:t>Instituição</w:t>
+      </w:r>
+    </w:p>
+    <w:p>
+      <w:pPr>
+        <w:jc w:val="both"/>
+      </w:pPr>
+      <w:r>
+        <w:t xml:space="preserve">Permite manter os dados de uma </w:t>
+      </w:r>
+      <w:r>
+        <w:t>instituição</w:t>
+      </w:r>
+      <w:r>
+        <w:t xml:space="preserve"> que poderá ter vários inventários.</w:t>
       </w:r>
     </w:p>
     <w:p>
@@ -43,7 +55,13 @@
         <w:jc w:val="both"/>
       </w:pPr>
       <w:r>
-        <w:t>Permite manter os dados de todos os setores relacionados a uma organização.</w:t>
+        <w:t xml:space="preserve">Permite manter os dados de todos os setores relacionados a uma </w:t>
+      </w:r>
+      <w:r>
+        <w:t>instituição</w:t>
+      </w:r>
+      <w:r>
+        <w:t>.</w:t>
       </w:r>
     </w:p>
     <w:p>
@@ -65,7 +83,13 @@
         <w:jc w:val="both"/>
       </w:pPr>
       <w:r>
-        <w:t>Permite cadastrar informações de inventários patrimoniais realizados por uma organização.</w:t>
+        <w:t xml:space="preserve">Permite cadastrar informações de inventários patrimoniais realizados por uma </w:t>
+      </w:r>
+      <w:r>
+        <w:t>instituição</w:t>
+      </w:r>
+      <w:r>
+        <w:t>.</w:t>
       </w:r>
     </w:p>
     <w:p>
@@ -87,7 +111,13 @@
         <w:jc w:val="both"/>
       </w:pPr>
       <w:r>
-        <w:t>Permite fazer o registro de todos os patrimônios de um setor em uma organização.</w:t>
+        <w:t xml:space="preserve">Permite fazer o registro de todos os patrimônios de um setor em uma </w:t>
+      </w:r>
+      <w:r>
+        <w:t>instituição</w:t>
+      </w:r>
+      <w:r>
+        <w:t>.</w:t>
       </w:r>
     </w:p>
     <w:p>
@@ -109,7 +139,13 @@
         <w:jc w:val="both"/>
       </w:pPr>
       <w:r>
-        <w:t>Permite exportar em formato de planilha excel um inventário realizado por uma organização;</w:t>
+        <w:t xml:space="preserve">Permite exportar em formato de planilha excel um inventário realizado por uma </w:t>
+      </w:r>
+      <w:r>
+        <w:t>instituição</w:t>
+      </w:r>
+      <w:r>
+        <w:t>;</w:t>
       </w:r>
     </w:p>
     <w:p>
@@ -131,7 +167,25 @@
         <w:jc w:val="both"/>
       </w:pPr>
       <w:r>
-        <w:t>Permite importar através de uma planilha excel um inventário realizado por uma organização. Caso a organização, setor, inventários e/ou registro patrimonial não existam, deverão ser criados. Caso exista um registro patrimonial iniciado, deverá ATUALIZAR os dados existentes com a planilha importada. Isso permitirá que mais de um celular possa trabalhar fazendo o registro patrimonial.</w:t>
+        <w:t xml:space="preserve">Permite importar através de uma planilha excel um inventário realizado por uma </w:t>
+      </w:r>
+      <w:r>
+        <w:t>instituição</w:t>
+      </w:r>
+      <w:r>
+        <w:t xml:space="preserve">. Caso a </w:t>
+      </w:r>
+      <w:r>
+        <w:t>instituição</w:t>
+      </w:r>
+      <w:r>
+        <w:t>, setor, inventários e/ou registro patrimonial não existam, deverão ser criados</w:t>
+      </w:r>
+      <w:r>
+        <w:t xml:space="preserve"> durante a importação</w:t>
+      </w:r>
+      <w:r>
+        <w:t>. Caso exista um registro patrimonial iniciado, deverá ATUALIZAR os dados existentes com a planilha importada. Isso permitirá que mais de um celular possa trabalhar fazendo o registro patrimonial.</w:t>
       </w:r>
       <w:bookmarkStart w:id="0" w:name="_GoBack"/>
       <w:bookmarkEnd w:id="0"/>

</xml_diff>